<commit_message>
fix(ch1): code_interpreter 改走语句级 AST 白名单，封堵 exec 沙箱逃逸
新增 code_sandbox.py（DESIGN 6.5）：属性访问仅放行 math.<公开属性>，
import/函数定义/lambda/推导式/方法调用一律拒绝——().__class__ 逃逸链
第一环即失败（修复前 PoC 实测可拿到 os 模块，现被 UnsafeCode 拦截）。
实施中发现并修复 _check_statement 缺失 Expr 分支导致顶层调用语句
绕过校验的漏洞；测试补方法调用拒绝用例。工程 100 测试全绿，
agent.py 仅替换 code_interpreter 实现路径，对外行为不变。
</commit_message>
<xml_diff>
--- a/chapter1/context/webui/DESIGN.docx
+++ b/chapter1/context/webui/DESIGN.docx
@@ -25,7 +25,7 @@
         <w:t xml:space="preserve">设计决策记录</w:t>
       </w:r>
     </w:p>
-    <w:bookmarkStart w:id="19" w:name="context-工程-web-gui-设计决策记录design"/>
+    <w:bookmarkStart w:id="20" w:name="context-工程-web-gui-设计决策记录design"/>
     <w:p>
       <w:pPr>
         <w:pStyle w:val="Heading1"/>
@@ -3887,8 +3887,25 @@
             <w:r>
               <w:rPr>
                 <w:rFonts w:hint="eastAsia"/>
-              </w:rPr>
-              <w:t xml:space="preserve">已知风险继承：</w:t>
+                <w:b/>
+                <w:bCs/>
+              </w:rPr>
+              <w:t xml:space="preserve">已修复</w:t>
+            </w:r>
+            <w:r>
+              <w:rPr>
+                <w:rFonts w:hint="eastAsia"/>
+              </w:rPr>
+              <w:t xml:space="preserve">（2026-10-14</w:t>
+            </w:r>
+            <w:r>
+              <w:t xml:space="preserve"> </w:t>
+            </w:r>
+            <w:r>
+              <w:rPr>
+                <w:rFonts w:hint="eastAsia"/>
+              </w:rPr>
+              <w:t xml:space="preserve">修订，原决策"已知风险继承、暂缓修复"作废）：</w:t>
             </w:r>
             <w:r>
               <w:rPr>
@@ -3903,42 +3920,16 @@
               <w:rPr>
                 <w:rFonts w:hint="eastAsia"/>
               </w:rPr>
-              <w:t xml:space="preserve">的</w:t>
-            </w:r>
-            <w:r>
-              <w:t xml:space="preserve"> exec </w:t>
-            </w:r>
-            <w:r>
-              <w:rPr>
-                <w:rFonts w:hint="eastAsia"/>
-              </w:rPr>
-              <w:t xml:space="preserve">沙箱可逃逸（工程分析问题</w:t>
+              <w:t xml:space="preserve">改走</w:t>
             </w:r>
             <w:r>
               <w:t xml:space="preserve"> </w:t>
             </w:r>
             <w:r>
               <w:rPr>
-                <w:rFonts w:hint="eastAsia"/>
-              </w:rPr>
-              <w:t xml:space="preserve">2，暂缓修复）</w:t>
-            </w:r>
-          </w:p>
-        </w:tc>
-        <w:tc>
-          <w:tcPr/>
-          <w:p>
-            <w:pPr>
-              <w:pStyle w:val="Compact"/>
-            </w:pPr>
-            <w:r>
-              <w:t xml:space="preserve">GUI </w:t>
-            </w:r>
-            <w:r>
-              <w:rPr>
-                <w:rFonts w:hint="eastAsia"/>
-              </w:rPr>
-              <w:t xml:space="preserve">不改变威胁模型——仍是本地用户、自己的</w:t>
+                <w:rStyle w:val="VerbatimChar"/>
+              </w:rPr>
+              <w:t xml:space="preserve">code_sandbox.py</w:t>
             </w:r>
             <w:r>
               <w:t xml:space="preserve"> </w:t>
@@ -3947,7 +3938,30 @@
               <w:rPr>
                 <w:rFonts w:hint="eastAsia"/>
               </w:rPr>
-              <w:t xml:space="preserve">key、自己的任务；与</w:t>
+              <w:t xml:space="preserve">语句级</w:t>
+            </w:r>
+            <w:r>
+              <w:t xml:space="preserve"> AST </w:t>
+            </w:r>
+            <w:r>
+              <w:rPr>
+                <w:rFonts w:hint="eastAsia"/>
+              </w:rPr>
+              <w:t xml:space="preserve">白名单</w:t>
+            </w:r>
+          </w:p>
+        </w:tc>
+        <w:tc>
+          <w:tcPr/>
+          <w:p>
+            <w:pPr>
+              <w:pStyle w:val="Compact"/>
+            </w:pPr>
+            <w:r>
+              <w:rPr>
+                <w:rFonts w:hint="eastAsia"/>
+              </w:rPr>
+              <w:t xml:space="preserve">原风险与</w:t>
             </w:r>
             <w:r>
               <w:t xml:space="preserve"> CLI </w:t>
@@ -3956,56 +3970,7 @@
               <w:rPr>
                 <w:rFonts w:hint="eastAsia"/>
               </w:rPr>
-              <w:t xml:space="preserve">暴露面一致</w:t>
-            </w:r>
-          </w:p>
-        </w:tc>
-        <w:tc>
-          <w:tcPr/>
-          <w:p>
-            <w:pPr>
-              <w:pStyle w:val="Compact"/>
-            </w:pPr>
-            <w:r>
-              <w:rPr>
-                <w:rFonts w:hint="eastAsia"/>
-              </w:rPr>
-              <w:t xml:space="preserve">在</w:t>
-            </w:r>
-            <w:r>
-              <w:t xml:space="preserve"> GUI </w:t>
-            </w:r>
-            <w:r>
-              <w:rPr>
-                <w:rFonts w:hint="eastAsia"/>
-              </w:rPr>
-              <w:t xml:space="preserve">层单独禁用该工具（会造成</w:t>
-            </w:r>
-            <w:r>
-              <w:t xml:space="preserve"> GUI/CLI </w:t>
-            </w:r>
-            <w:r>
-              <w:rPr>
-                <w:rFonts w:hint="eastAsia"/>
-              </w:rPr>
-              <w:t xml:space="preserve">行为分叉，违背"全功能对齐"）</w:t>
-            </w:r>
-          </w:p>
-        </w:tc>
-        <w:tc>
-          <w:tcPr/>
-          <w:p>
-            <w:pPr>
-              <w:pStyle w:val="Compact"/>
-            </w:pPr>
-            <w:r>
-              <w:t xml:space="preserve">README </w:t>
-            </w:r>
-            <w:r>
-              <w:rPr>
-                <w:rFonts w:hint="eastAsia"/>
-              </w:rPr>
-              <w:t xml:space="preserve">需提示：GUI</w:t>
+              <w:t xml:space="preserve">相同（本地用户、自己的</w:t>
             </w:r>
             <w:r>
               <w:t xml:space="preserve"> </w:t>
@@ -4014,7 +3979,158 @@
               <w:rPr>
                 <w:rFonts w:hint="eastAsia"/>
               </w:rPr>
-              <w:t xml:space="preserve">仅限本机使用</w:t>
+              <w:t xml:space="preserve">key），但用户决定不再继承：exec</w:t>
+            </w:r>
+            <w:r>
+              <w:t xml:space="preserve"> </w:t>
+            </w:r>
+            <w:r>
+              <w:rPr>
+                <w:rFonts w:hint="eastAsia"/>
+              </w:rPr>
+              <w:t xml:space="preserve">命名空间沙箱可被</w:t>
+            </w:r>
+            <w:r>
+              <w:t xml:space="preserve"> </w:t>
+            </w:r>
+            <w:r>
+              <w:rPr>
+                <w:rStyle w:val="VerbatimChar"/>
+              </w:rPr>
+              <w:t xml:space="preserve">().__class__.__mro__</w:t>
+            </w:r>
+            <w:r>
+              <w:t xml:space="preserve"> </w:t>
+            </w:r>
+            <w:r>
+              <w:rPr>
+                <w:rFonts w:hint="eastAsia"/>
+              </w:rPr>
+              <w:t xml:space="preserve">链逃逸（已实测），GUI</w:t>
+            </w:r>
+            <w:r>
+              <w:t xml:space="preserve"> </w:t>
+            </w:r>
+            <w:r>
+              <w:rPr>
+                <w:rFonts w:hint="eastAsia"/>
+              </w:rPr>
+              <w:t xml:space="preserve">使触发面变大；修复与</w:t>
+            </w:r>
+            <w:r>
+              <w:t xml:space="preserve"> </w:t>
+            </w:r>
+            <w:r>
+              <w:rPr>
+                <w:rStyle w:val="VerbatimChar"/>
+              </w:rPr>
+              <w:t xml:space="preserve">calc_sandbox.py</w:t>
+            </w:r>
+            <w:r>
+              <w:t xml:space="preserve"> </w:t>
+            </w:r>
+            <w:r>
+              <w:rPr>
+                <w:rFonts w:hint="eastAsia"/>
+              </w:rPr>
+              <w:t xml:space="preserve">同哲学——语法树层拒绝</w:t>
+            </w:r>
+            <w:r>
+              <w:t xml:space="preserve"> </w:t>
+            </w:r>
+            <w:r>
+              <w:rPr>
+                <w:rStyle w:val="VerbatimChar"/>
+              </w:rPr>
+              <w:t xml:space="preserve">ast.Attribute</w:t>
+            </w:r>
+            <w:r>
+              <w:rPr>
+                <w:rFonts w:hint="eastAsia"/>
+              </w:rPr>
+              <w:t xml:space="preserve">（唯一例外</w:t>
+            </w:r>
+            <w:r>
+              <w:t xml:space="preserve"> </w:t>
+            </w:r>
+            <w:r>
+              <w:rPr>
+                <w:rStyle w:val="VerbatimChar"/>
+              </w:rPr>
+              <w:t xml:space="preserve">math.&lt;attr&gt;</w:t>
+            </w:r>
+            <w:r>
+              <w:rPr>
+                <w:rFonts w:hint="eastAsia"/>
+              </w:rPr>
+              <w:t xml:space="preserve">）、Import/FunctionDef/Lambda/Comprehension</w:t>
+            </w:r>
+            <w:r>
+              <w:t xml:space="preserve"> </w:t>
+            </w:r>
+            <w:r>
+              <w:rPr>
+                <w:rFonts w:hint="eastAsia"/>
+              </w:rPr>
+              <w:t xml:space="preserve">等，逃逸链第一环即失败</w:t>
+            </w:r>
+          </w:p>
+        </w:tc>
+        <w:tc>
+          <w:tcPr/>
+          <w:p>
+            <w:pPr>
+              <w:pStyle w:val="Compact"/>
+            </w:pPr>
+            <w:r>
+              <w:rPr>
+                <w:rFonts w:hint="eastAsia"/>
+              </w:rPr>
+              <w:t xml:space="preserve">命名空间沙箱修补（原理上不可靠，calc_sandbox.py</w:t>
+            </w:r>
+            <w:r>
+              <w:t xml:space="preserve"> </w:t>
+            </w:r>
+            <w:r>
+              <w:rPr>
+                <w:rFonts w:hint="eastAsia"/>
+              </w:rPr>
+              <w:t xml:space="preserve">文档已论证）；子进程隔离（跨平台过重）；删除该工具（丧失多步聚合能力）</w:t>
+            </w:r>
+          </w:p>
+        </w:tc>
+        <w:tc>
+          <w:tcPr/>
+          <w:p>
+            <w:pPr>
+              <w:pStyle w:val="Compact"/>
+            </w:pPr>
+            <w:r>
+              <w:rPr>
+                <w:rFonts w:hint="eastAsia"/>
+              </w:rPr>
+              <w:t xml:space="preserve">模型生成的代码若用受限语法（如</w:t>
+            </w:r>
+            <w:r>
+              <w:t xml:space="preserve"> </w:t>
+            </w:r>
+            <w:r>
+              <w:rPr>
+                <w:rStyle w:val="VerbatimChar"/>
+              </w:rPr>
+              <w:t xml:space="preserve">result.total</w:t>
+            </w:r>
+            <w:r>
+              <w:t xml:space="preserve"> </w:t>
+            </w:r>
+            <w:r>
+              <w:rPr>
+                <w:rFonts w:hint="eastAsia"/>
+              </w:rPr>
+              <w:t xml:space="preserve">属性访问、列表推导式）将收到明确报错而非静默执行；无限循环风险与修复前相同（无超时），见</w:t>
+            </w:r>
+            <w:r>
+              <w:t xml:space="preserve"> webui/README</w:t>
             </w:r>
           </w:p>
         </w:tc>
@@ -5407,19 +5523,84 @@
       </w:r>
     </w:p>
     <w:bookmarkEnd w:id="16"/>
-    <w:bookmarkStart w:id="17" w:name="X2ecf002a4e667762f09f64a65337abb9a145cd7"/>
+    <w:bookmarkStart w:id="17" w:name="X031dc47a4853d43dcbd52e915f68e47024539d0"/>
     <w:p>
       <w:pPr>
         <w:pStyle w:val="Heading2"/>
       </w:pPr>
       <w:r>
-        <w:t xml:space="preserve">7. </w:t>
-      </w:r>
-      <w:r>
-        <w:rPr>
-          <w:rFonts w:hint="eastAsia"/>
-        </w:rPr>
-        <w:t xml:space="preserve">测试策略</w:t>
+        <w:t xml:space="preserve">6.5 code_sandbox </w:t>
+      </w:r>
+      <w:r>
+        <w:rPr>
+          <w:rFonts w:hint="eastAsia"/>
+        </w:rPr>
+        <w:t xml:space="preserve">修复设计（D8</w:t>
+      </w:r>
+      <w:r>
+        <w:t xml:space="preserve"> </w:t>
+      </w:r>
+      <w:r>
+        <w:rPr>
+          <w:rFonts w:hint="eastAsia"/>
+        </w:rPr>
+        <w:t xml:space="preserve">配套，2026-10-14）</w:t>
+      </w:r>
+    </w:p>
+    <w:p>
+      <w:pPr>
+        <w:pStyle w:val="FirstParagraph"/>
+      </w:pPr>
+      <w:r>
+        <w:rPr>
+          <w:rFonts w:hint="eastAsia"/>
+        </w:rPr>
+        <w:t xml:space="preserve">新增</w:t>
+      </w:r>
+      <w:r>
+        <w:t xml:space="preserve"> </w:t>
+      </w:r>
+      <w:r>
+        <w:rPr>
+          <w:rStyle w:val="VerbatimChar"/>
+        </w:rPr>
+        <w:t xml:space="preserve">chapter1/context/code_sandbox.py</w:t>
+      </w:r>
+      <w:r>
+        <w:rPr>
+          <w:rFonts w:hint="eastAsia"/>
+        </w:rPr>
+        <w:t xml:space="preserve">，</w:t>
+      </w:r>
+      <w:r>
+        <w:rPr>
+          <w:rStyle w:val="VerbatimChar"/>
+        </w:rPr>
+        <w:t xml:space="preserve">agent.ToolRegistry.code_interpreter</w:t>
+      </w:r>
+      <w:r>
+        <w:t xml:space="preserve"> </w:t>
+      </w:r>
+      <w:r>
+        <w:rPr>
+          <w:rFonts w:hint="eastAsia"/>
+        </w:rPr>
+        <w:t xml:space="preserve">改为调用其</w:t>
+      </w:r>
+      <w:r>
+        <w:t xml:space="preserve"> </w:t>
+      </w:r>
+      <w:r>
+        <w:rPr>
+          <w:rStyle w:val="VerbatimChar"/>
+        </w:rPr>
+        <w:t xml:space="preserve">safe_exec(code)</w:t>
+      </w:r>
+      <w:r>
+        <w:rPr>
+          <w:rFonts w:hint="eastAsia"/>
+        </w:rPr>
+        <w:t xml:space="preserve">：</w:t>
       </w:r>
     </w:p>
     <w:p>
@@ -5431,124 +5612,19 @@
         </w:numPr>
       </w:pPr>
       <w:r>
-        <w:t xml:space="preserve">TestClient </w:t>
-      </w:r>
-      <w:r>
-        <w:rPr>
-          <w:rFonts w:hint="eastAsia"/>
-        </w:rPr>
-        <w:t xml:space="preserve">不触网：providers/samples/defaults</w:t>
-      </w:r>
-      <w:r>
-        <w:t xml:space="preserve"> </w:t>
-      </w:r>
-      <w:r>
-        <w:rPr>
-          <w:rFonts w:hint="eastAsia"/>
-        </w:rPr>
-        <w:t xml:space="preserve">契约；单任务</w:t>
-      </w:r>
-      <w:r>
-        <w:t xml:space="preserve"> monkeypatch</w:t>
-      </w:r>
-      <w:r>
-        <w:t xml:space="preserve"> </w:t>
-      </w:r>
-      <w:r>
         <w:rPr>
           <w:rStyle w:val="VerbatimChar"/>
         </w:rPr>
-        <w:t xml:space="preserve">agent_runner.run_single_task</w:t>
-      </w:r>
-      <w:r>
-        <w:rPr>
-          <w:rFonts w:hint="eastAsia"/>
-        </w:rPr>
-        <w:t xml:space="preserve">（参数透传</w:t>
-      </w:r>
-      <w:r>
-        <w:t xml:space="preserve"> + status </w:t>
-      </w:r>
-      <w:r>
-        <w:rPr>
-          <w:rFonts w:hint="eastAsia"/>
-        </w:rPr>
-        <w:t xml:space="preserve">映射</w:t>
-      </w:r>
-      <w:r>
-        <w:t xml:space="preserve"> + grounding </w:t>
-      </w:r>
-      <w:r>
-        <w:rPr>
-          <w:rFonts w:hint="eastAsia"/>
-        </w:rPr>
-        <w:t xml:space="preserve">字段）；job</w:t>
-      </w:r>
-      <w:r>
-        <w:t xml:space="preserve"> </w:t>
-      </w:r>
-      <w:r>
-        <w:rPr>
-          <w:rFonts w:hint="eastAsia"/>
-        </w:rPr>
-        <w:t xml:space="preserve">生命周期用</w:t>
-      </w:r>
-      <w:r>
-        <w:t xml:space="preserve"> fake </w:t>
-      </w:r>
-      <w:r>
-        <w:rPr>
-          <w:rFonts w:hint="eastAsia"/>
-        </w:rPr>
-        <w:t xml:space="preserve">套件（毫秒级、2</w:t>
-      </w:r>
-      <w:r>
-        <w:t xml:space="preserve"> </w:t>
-      </w:r>
-      <w:r>
-        <w:rPr>
-          <w:rFonts w:hint="eastAsia"/>
-        </w:rPr>
-        <w:t xml:space="preserve">案例断言进度</w:t>
-      </w:r>
-      <w:r>
-        <w:t xml:space="preserve"> done/total </w:t>
-      </w:r>
-      <w:r>
-        <w:rPr>
-          <w:rFonts w:hint="eastAsia"/>
-        </w:rPr>
-        <w:t xml:space="preserve">递增、报告端点返回</w:t>
-      </w:r>
-      <w:r>
-        <w:t xml:space="preserve"> MD </w:t>
-      </w:r>
-      <w:r>
-        <w:rPr>
-          <w:rFonts w:hint="eastAsia"/>
-        </w:rPr>
-        <w:t xml:space="preserve">文本）；409</w:t>
-      </w:r>
-      <w:r>
-        <w:t xml:space="preserve"> </w:t>
-      </w:r>
-      <w:r>
-        <w:rPr>
-          <w:rFonts w:hint="eastAsia"/>
-        </w:rPr>
-        <w:t xml:space="preserve">并发拒绝；404</w:t>
-      </w:r>
-      <w:r>
-        <w:t xml:space="preserve"> </w:t>
-      </w:r>
-      <w:r>
-        <w:rPr>
-          <w:rFonts w:hint="eastAsia"/>
-        </w:rPr>
-        <w:t xml:space="preserve">轮询；历史</w:t>
-      </w:r>
-      <w:r>
-        <w:t xml:space="preserve"> FIFO。</w:t>
+        <w:t xml:space="preserve">ast.parse(code, mode="exec")</w:t>
+      </w:r>
+      <w:r>
+        <w:t xml:space="preserve"> </w:t>
+      </w:r>
+      <w:r>
+        <w:rPr>
+          <w:rFonts w:hint="eastAsia"/>
+        </w:rPr>
+        <w:t xml:space="preserve">后递归校验每个节点；</w:t>
       </w:r>
     </w:p>
     <w:p>
@@ -5562,51 +5638,381 @@
       <w:r>
         <w:rPr>
           <w:rFonts w:hint="eastAsia"/>
-        </w:rPr>
-        <w:t xml:space="preserve">既有</w:t>
-      </w:r>
-      <w:r>
-        <w:t xml:space="preserve"> 52 </w:t>
-      </w:r>
-      <w:r>
-        <w:rPr>
-          <w:rFonts w:hint="eastAsia"/>
-        </w:rPr>
-        <w:t xml:space="preserve">测试零回归</w:t>
-      </w:r>
-      <w:r>
-        <w:t xml:space="preserve"> + CLI </w:t>
-      </w:r>
-      <w:r>
-        <w:rPr>
-          <w:rFonts w:hint="eastAsia"/>
-        </w:rPr>
-        <w:t xml:space="preserve">行为不变为硬门槛。</w:t>
+          <w:b/>
+          <w:bCs/>
+        </w:rPr>
+        <w:t xml:space="preserve">语句白名单</w:t>
+      </w:r>
+      <w:r>
+        <w:rPr>
+          <w:rFonts w:hint="eastAsia"/>
+        </w:rPr>
+        <w:t xml:space="preserve">：</w:t>
+      </w:r>
+      <w:r>
+        <w:rPr>
+          <w:rStyle w:val="VerbatimChar"/>
+        </w:rPr>
+        <w:t xml:space="preserve">Assign / AugAssign / AnnAssign / Expr / For / While / If / Break / Continue / Pass</w:t>
+      </w:r>
+      <w:r>
+        <w:rPr>
+          <w:rFonts w:hint="eastAsia"/>
+        </w:rPr>
+        <w:t xml:space="preserve">；</w:t>
+      </w:r>
+    </w:p>
+    <w:p>
+      <w:pPr>
+        <w:pStyle w:val="Compact"/>
+        <w:numPr>
+          <w:ilvl w:val="0"/>
+          <w:numId w:val="1002"/>
+        </w:numPr>
+      </w:pPr>
+      <w:r>
+        <w:rPr>
+          <w:rFonts w:hint="eastAsia"/>
+          <w:b/>
+          <w:bCs/>
+        </w:rPr>
+        <w:t xml:space="preserve">表达式白名单</w:t>
+      </w:r>
+      <w:r>
+        <w:rPr>
+          <w:rFonts w:hint="eastAsia"/>
+        </w:rPr>
+        <w:t xml:space="preserve">：</w:t>
+      </w:r>
+      <w:r>
+        <w:rPr>
+          <w:rStyle w:val="VerbatimChar"/>
+        </w:rPr>
+        <w:t xml:space="preserve">BinOp / UnaryOp / BoolOp / Compare / Call / Name / Constant / List / Tuple / Dict / Subscript / Slice / JoinedStr / FormattedValue / IfExp</w:t>
+      </w:r>
+      <w:r>
+        <w:rPr>
+          <w:rFonts w:hint="eastAsia"/>
+        </w:rPr>
+        <w:t xml:space="preserve">；</w:t>
+      </w:r>
+    </w:p>
+    <w:p>
+      <w:pPr>
+        <w:pStyle w:val="Compact"/>
+        <w:numPr>
+          <w:ilvl w:val="0"/>
+          <w:numId w:val="1002"/>
+        </w:numPr>
+      </w:pPr>
+      <w:r>
+        <w:rPr>
+          <w:b/>
+          <w:bCs/>
+        </w:rPr>
+        <w:t xml:space="preserve">Attribute </w:t>
+      </w:r>
+      <w:r>
+        <w:rPr>
+          <w:rFonts w:hint="eastAsia"/>
+          <w:b/>
+          <w:bCs/>
+        </w:rPr>
+        <w:t xml:space="preserve">例外规则</w:t>
+      </w:r>
+      <w:r>
+        <w:rPr>
+          <w:rFonts w:hint="eastAsia"/>
+        </w:rPr>
+        <w:t xml:space="preserve">：仅当</w:t>
+      </w:r>
+      <w:r>
+        <w:t xml:space="preserve"> </w:t>
+      </w:r>
+      <w:r>
+        <w:rPr>
+          <w:rStyle w:val="VerbatimChar"/>
+        </w:rPr>
+        <w:t xml:space="preserve">value</w:t>
+      </w:r>
+      <w:r>
+        <w:t xml:space="preserve"> </w:t>
+      </w:r>
+      <w:r>
+        <w:rPr>
+          <w:rFonts w:hint="eastAsia"/>
+        </w:rPr>
+        <w:t xml:space="preserve">是</w:t>
+      </w:r>
+      <w:r>
+        <w:t xml:space="preserve"> </w:t>
+      </w:r>
+      <w:r>
+        <w:rPr>
+          <w:rStyle w:val="VerbatimChar"/>
+        </w:rPr>
+        <w:t xml:space="preserve">Name(id="math")</w:t>
+      </w:r>
+      <w:r>
+        <w:t xml:space="preserve"> </w:t>
+      </w:r>
+      <w:r>
+        <w:rPr>
+          <w:rFonts w:hint="eastAsia"/>
+        </w:rPr>
+        <w:t xml:space="preserve">时放行（</w:t>
+      </w:r>
+      <w:r>
+        <w:rPr>
+          <w:rStyle w:val="VerbatimChar"/>
+        </w:rPr>
+        <w:t xml:space="preserve">math.sin(x)</w:t>
+      </w:r>
+      <w:r>
+        <w:t xml:space="preserve"> </w:t>
+      </w:r>
+      <w:r>
+        <w:rPr>
+          <w:rFonts w:hint="eastAsia"/>
+        </w:rPr>
+        <w:t xml:space="preserve">合法），其余一律</w:t>
+      </w:r>
+      <w:r>
+        <w:t xml:space="preserve"> </w:t>
+      </w:r>
+      <w:r>
+        <w:rPr>
+          <w:rStyle w:val="VerbatimChar"/>
+        </w:rPr>
+        <w:t xml:space="preserve">UnsafeCode</w:t>
+      </w:r>
+      <w:r>
+        <w:rPr>
+          <w:rFonts w:hint="eastAsia"/>
+        </w:rPr>
+        <w:t xml:space="preserve">——这一条使</w:t>
+      </w:r>
+      <w:r>
+        <w:t xml:space="preserve"> </w:t>
+      </w:r>
+      <w:r>
+        <w:rPr>
+          <w:rStyle w:val="VerbatimChar"/>
+        </w:rPr>
+        <w:t xml:space="preserve">().__class__</w:t>
+      </w:r>
+      <w:r>
+        <w:t xml:space="preserve"> </w:t>
+      </w:r>
+      <w:r>
+        <w:rPr>
+          <w:rFonts w:hint="eastAsia"/>
+        </w:rPr>
+        <w:t xml:space="preserve">逃逸链第一环即失败；</w:t>
+      </w:r>
+    </w:p>
+    <w:p>
+      <w:pPr>
+        <w:pStyle w:val="Compact"/>
+        <w:numPr>
+          <w:ilvl w:val="0"/>
+          <w:numId w:val="1002"/>
+        </w:numPr>
+      </w:pPr>
+      <w:r>
+        <w:rPr>
+          <w:b/>
+          <w:bCs/>
+        </w:rPr>
+        <w:t xml:space="preserve">Call </w:t>
+      </w:r>
+      <w:r>
+        <w:rPr>
+          <w:rFonts w:hint="eastAsia"/>
+          <w:b/>
+          <w:bCs/>
+        </w:rPr>
+        <w:t xml:space="preserve">规则</w:t>
+      </w:r>
+      <w:r>
+        <w:rPr>
+          <w:rFonts w:hint="eastAsia"/>
+        </w:rPr>
+        <w:t xml:space="preserve">：仅白名单名字可调用（与既有</w:t>
+      </w:r>
+      <w:r>
+        <w:t xml:space="preserve"> builtins </w:t>
+      </w:r>
+      <w:r>
+        <w:rPr>
+          <w:rFonts w:hint="eastAsia"/>
+        </w:rPr>
+        <w:t xml:space="preserve">白名单一致）；</w:t>
+      </w:r>
+    </w:p>
+    <w:p>
+      <w:pPr>
+        <w:pStyle w:val="Compact"/>
+        <w:numPr>
+          <w:ilvl w:val="0"/>
+          <w:numId w:val="1002"/>
+        </w:numPr>
+      </w:pPr>
+      <w:r>
+        <w:rPr>
+          <w:rStyle w:val="VerbatimChar"/>
+        </w:rPr>
+        <w:t xml:space="preserve">Import / ImportFrom / Lambda / FunctionDef / ClassDef / ListComp / SetComp / DictComp / GeneratorExp / Try / With / Starred / Global / Nonlocal</w:t>
+      </w:r>
+      <w:r>
+        <w:t xml:space="preserve"> </w:t>
+      </w:r>
+      <w:r>
+        <w:rPr>
+          <w:rFonts w:hint="eastAsia"/>
+        </w:rPr>
+        <w:t xml:space="preserve">一律拒绝；</w:t>
+      </w:r>
+    </w:p>
+    <w:p>
+      <w:pPr>
+        <w:pStyle w:val="Compact"/>
+        <w:numPr>
+          <w:ilvl w:val="0"/>
+          <w:numId w:val="1002"/>
+        </w:numPr>
+      </w:pPr>
+      <w:r>
+        <w:rPr>
+          <w:rFonts w:hint="eastAsia"/>
+        </w:rPr>
+        <w:t xml:space="preserve">校验通过后</w:t>
+      </w:r>
+      <w:r>
+        <w:t xml:space="preserve"> </w:t>
+      </w:r>
+      <w:r>
+        <w:rPr>
+          <w:rStyle w:val="VerbatimChar"/>
+        </w:rPr>
+        <w:t xml:space="preserve">compile</w:t>
+      </w:r>
+      <w:r>
+        <w:t xml:space="preserve"> </w:t>
+      </w:r>
+      <w:r>
+        <w:rPr>
+          <w:rFonts w:hint="eastAsia"/>
+        </w:rPr>
+        <w:t xml:space="preserve">执行，命名空间、stdout</w:t>
+      </w:r>
+      <w:r>
+        <w:t xml:space="preserve"> </w:t>
+      </w:r>
+      <w:r>
+        <w:rPr>
+          <w:rFonts w:hint="eastAsia"/>
+        </w:rPr>
+        <w:t xml:space="preserve">捕获与结果提取沿用现有逻辑（</w:t>
+      </w:r>
+      <w:r>
+        <w:rPr>
+          <w:rStyle w:val="VerbatimChar"/>
+        </w:rPr>
+        <w:t xml:space="preserve">agent.py</w:t>
+      </w:r>
+      <w:r>
+        <w:t xml:space="preserve"> </w:t>
+      </w:r>
+      <w:r>
+        <w:rPr>
+          <w:rFonts w:hint="eastAsia"/>
+        </w:rPr>
+        <w:t xml:space="preserve">不再自带受限</w:t>
+      </w:r>
+      <w:r>
+        <w:t xml:space="preserve"> namespace </w:t>
+      </w:r>
+      <w:r>
+        <w:rPr>
+          <w:rFonts w:hint="eastAsia"/>
+        </w:rPr>
+        <w:t xml:space="preserve">构造）。</w:t>
+      </w:r>
+    </w:p>
+    <w:p>
+      <w:pPr>
+        <w:pStyle w:val="FirstParagraph"/>
+      </w:pPr>
+      <w:r>
+        <w:rPr>
+          <w:rFonts w:hint="eastAsia"/>
+        </w:rPr>
+        <w:t xml:space="preserve">验收锚点：</w:t>
+      </w:r>
+      <w:r>
+        <w:rPr>
+          <w:rStyle w:val="VerbatimChar"/>
+        </w:rPr>
+        <w:t xml:space="preserve">().__class__.__mro__[1].__subclasses__()</w:t>
+      </w:r>
+      <w:r>
+        <w:t xml:space="preserve"> </w:t>
+      </w:r>
+      <w:r>
+        <w:rPr>
+          <w:rFonts w:hint="eastAsia"/>
+        </w:rPr>
+        <w:t xml:space="preserve">链必须抛</w:t>
+      </w:r>
+      <w:r>
+        <w:t xml:space="preserve"> </w:t>
+      </w:r>
+      <w:r>
+        <w:rPr>
+          <w:rStyle w:val="VerbatimChar"/>
+        </w:rPr>
+        <w:t xml:space="preserve">UnsafeCode</w:t>
+      </w:r>
+      <w:r>
+        <w:rPr>
+          <w:rFonts w:hint="eastAsia"/>
+        </w:rPr>
+        <w:t xml:space="preserve">；工具描述中的示例代码必须原样可运行；新增</w:t>
+      </w:r>
+      <w:r>
+        <w:t xml:space="preserve"> </w:t>
+      </w:r>
+      <w:r>
+        <w:rPr>
+          <w:rStyle w:val="VerbatimChar"/>
+        </w:rPr>
+        <w:t xml:space="preserve">tests/test_code_sandbox.py</w:t>
+      </w:r>
+      <w:r>
+        <w:t xml:space="preserve"> </w:t>
+      </w:r>
+      <w:r>
+        <w:rPr>
+          <w:rFonts w:hint="eastAsia"/>
+        </w:rPr>
+        <w:t xml:space="preserve">覆盖两类用例。</w:t>
       </w:r>
     </w:p>
     <w:bookmarkEnd w:id="17"/>
-    <w:bookmarkStart w:id="18" w:name="X4cc6446004f79163f36749301512062373a5060"/>
+    <w:bookmarkStart w:id="18" w:name="X2ecf002a4e667762f09f64a65337abb9a145cd7"/>
     <w:p>
       <w:pPr>
         <w:pStyle w:val="Heading2"/>
       </w:pPr>
       <w:r>
-        <w:t xml:space="preserve">8. </w:t>
-      </w:r>
-      <w:r>
-        <w:rPr>
-          <w:rFonts w:hint="eastAsia"/>
-        </w:rPr>
-        <w:t xml:space="preserve">演进触发点（任一出现</w:t>
-      </w:r>
-      <w:r>
-        <w:t xml:space="preserve"> → </w:t>
-      </w:r>
-      <w:r>
-        <w:rPr>
-          <w:rFonts w:hint="eastAsia"/>
-        </w:rPr>
-        <w:t xml:space="preserve">另写详细设计）</w:t>
+        <w:t xml:space="preserve">7. </w:t>
+      </w:r>
+      <w:r>
+        <w:rPr>
+          <w:rFonts w:hint="eastAsia"/>
+        </w:rPr>
+        <w:t xml:space="preserve">测试策略</w:t>
       </w:r>
     </w:p>
     <w:p>
@@ -5618,10 +6024,124 @@
         </w:numPr>
       </w:pPr>
       <w:r>
-        <w:rPr>
-          <w:rFonts w:hint="eastAsia"/>
-        </w:rPr>
-        <w:t xml:space="preserve">前端需要多页/路由或组件框架</w:t>
+        <w:t xml:space="preserve">TestClient </w:t>
+      </w:r>
+      <w:r>
+        <w:rPr>
+          <w:rFonts w:hint="eastAsia"/>
+        </w:rPr>
+        <w:t xml:space="preserve">不触网：providers/samples/defaults</w:t>
+      </w:r>
+      <w:r>
+        <w:t xml:space="preserve"> </w:t>
+      </w:r>
+      <w:r>
+        <w:rPr>
+          <w:rFonts w:hint="eastAsia"/>
+        </w:rPr>
+        <w:t xml:space="preserve">契约；单任务</w:t>
+      </w:r>
+      <w:r>
+        <w:t xml:space="preserve"> monkeypatch</w:t>
+      </w:r>
+      <w:r>
+        <w:t xml:space="preserve"> </w:t>
+      </w:r>
+      <w:r>
+        <w:rPr>
+          <w:rStyle w:val="VerbatimChar"/>
+        </w:rPr>
+        <w:t xml:space="preserve">agent_runner.run_single_task</w:t>
+      </w:r>
+      <w:r>
+        <w:rPr>
+          <w:rFonts w:hint="eastAsia"/>
+        </w:rPr>
+        <w:t xml:space="preserve">（参数透传</w:t>
+      </w:r>
+      <w:r>
+        <w:t xml:space="preserve"> + status </w:t>
+      </w:r>
+      <w:r>
+        <w:rPr>
+          <w:rFonts w:hint="eastAsia"/>
+        </w:rPr>
+        <w:t xml:space="preserve">映射</w:t>
+      </w:r>
+      <w:r>
+        <w:t xml:space="preserve"> + grounding </w:t>
+      </w:r>
+      <w:r>
+        <w:rPr>
+          <w:rFonts w:hint="eastAsia"/>
+        </w:rPr>
+        <w:t xml:space="preserve">字段）；job</w:t>
+      </w:r>
+      <w:r>
+        <w:t xml:space="preserve"> </w:t>
+      </w:r>
+      <w:r>
+        <w:rPr>
+          <w:rFonts w:hint="eastAsia"/>
+        </w:rPr>
+        <w:t xml:space="preserve">生命周期用</w:t>
+      </w:r>
+      <w:r>
+        <w:t xml:space="preserve"> fake </w:t>
+      </w:r>
+      <w:r>
+        <w:rPr>
+          <w:rFonts w:hint="eastAsia"/>
+        </w:rPr>
+        <w:t xml:space="preserve">套件（毫秒级、2</w:t>
+      </w:r>
+      <w:r>
+        <w:t xml:space="preserve"> </w:t>
+      </w:r>
+      <w:r>
+        <w:rPr>
+          <w:rFonts w:hint="eastAsia"/>
+        </w:rPr>
+        <w:t xml:space="preserve">案例断言进度</w:t>
+      </w:r>
+      <w:r>
+        <w:t xml:space="preserve"> done/total </w:t>
+      </w:r>
+      <w:r>
+        <w:rPr>
+          <w:rFonts w:hint="eastAsia"/>
+        </w:rPr>
+        <w:t xml:space="preserve">递增、报告端点返回</w:t>
+      </w:r>
+      <w:r>
+        <w:t xml:space="preserve"> MD </w:t>
+      </w:r>
+      <w:r>
+        <w:rPr>
+          <w:rFonts w:hint="eastAsia"/>
+        </w:rPr>
+        <w:t xml:space="preserve">文本）；409</w:t>
+      </w:r>
+      <w:r>
+        <w:t xml:space="preserve"> </w:t>
+      </w:r>
+      <w:r>
+        <w:rPr>
+          <w:rFonts w:hint="eastAsia"/>
+        </w:rPr>
+        <w:t xml:space="preserve">并发拒绝；404</w:t>
+      </w:r>
+      <w:r>
+        <w:t xml:space="preserve"> </w:t>
+      </w:r>
+      <w:r>
+        <w:rPr>
+          <w:rFonts w:hint="eastAsia"/>
+        </w:rPr>
+        <w:t xml:space="preserve">轮询；历史</w:t>
+      </w:r>
+      <w:r>
+        <w:t xml:space="preserve"> FIFO。</w:t>
       </w:r>
     </w:p>
     <w:p>
@@ -5636,16 +6156,50 @@
         <w:rPr>
           <w:rFonts w:hint="eastAsia"/>
         </w:rPr>
-        <w:t xml:space="preserve">消融并行化（多</w:t>
-      </w:r>
-      <w:r>
-        <w:t xml:space="preserve"> provider </w:t>
-      </w:r>
-      <w:r>
-        <w:rPr>
-          <w:rFonts w:hint="eastAsia"/>
-        </w:rPr>
-        <w:t xml:space="preserve">同时跑）或持久化历史</w:t>
+        <w:t xml:space="preserve">既有</w:t>
+      </w:r>
+      <w:r>
+        <w:t xml:space="preserve"> 52 </w:t>
+      </w:r>
+      <w:r>
+        <w:rPr>
+          <w:rFonts w:hint="eastAsia"/>
+        </w:rPr>
+        <w:t xml:space="preserve">测试零回归</w:t>
+      </w:r>
+      <w:r>
+        <w:t xml:space="preserve"> + CLI </w:t>
+      </w:r>
+      <w:r>
+        <w:rPr>
+          <w:rFonts w:hint="eastAsia"/>
+        </w:rPr>
+        <w:t xml:space="preserve">行为不变为硬门槛。</w:t>
+      </w:r>
+    </w:p>
+    <w:bookmarkEnd w:id="18"/>
+    <w:bookmarkStart w:id="19" w:name="X4cc6446004f79163f36749301512062373a5060"/>
+    <w:p>
+      <w:pPr>
+        <w:pStyle w:val="Heading2"/>
+      </w:pPr>
+      <w:r>
+        <w:t xml:space="preserve">8. </w:t>
+      </w:r>
+      <w:r>
+        <w:rPr>
+          <w:rFonts w:hint="eastAsia"/>
+        </w:rPr>
+        <w:t xml:space="preserve">演进触发点（任一出现</w:t>
+      </w:r>
+      <w:r>
+        <w:t xml:space="preserve"> → </w:t>
+      </w:r>
+      <w:r>
+        <w:rPr>
+          <w:rFonts w:hint="eastAsia"/>
+        </w:rPr>
+        <w:t xml:space="preserve">另写详细设计）</w:t>
       </w:r>
     </w:p>
     <w:p>
@@ -5653,17 +6207,14 @@
         <w:pStyle w:val="Compact"/>
         <w:numPr>
           <w:ilvl w:val="0"/>
-          <w:numId w:val="1003"/>
+          <w:numId w:val="1004"/>
         </w:numPr>
       </w:pPr>
       <w:r>
-        <w:t xml:space="preserve">WebSocket </w:t>
-      </w:r>
-      <w:r>
-        <w:rPr>
-          <w:rFonts w:hint="eastAsia"/>
-        </w:rPr>
-        <w:t xml:space="preserve">推送替代轮询</w:t>
+        <w:rPr>
+          <w:rFonts w:hint="eastAsia"/>
+        </w:rPr>
+        <w:t xml:space="preserve">前端需要多页/路由或组件框架</w:t>
       </w:r>
     </w:p>
     <w:p>
@@ -5671,50 +6222,23 @@
         <w:pStyle w:val="Compact"/>
         <w:numPr>
           <w:ilvl w:val="0"/>
-          <w:numId w:val="1003"/>
+          <w:numId w:val="1004"/>
         </w:numPr>
       </w:pPr>
       <w:r>
         <w:rPr>
           <w:rFonts w:hint="eastAsia"/>
         </w:rPr>
-        <w:t xml:space="preserve">上游把</w:t>
-      </w:r>
-      <w:r>
-        <w:t xml:space="preserve"> context </w:t>
-      </w:r>
-      <w:r>
-        <w:rPr>
-          <w:rFonts w:hint="eastAsia"/>
-        </w:rPr>
-        <w:t xml:space="preserve">收进</w:t>
-      </w:r>
-      <w:r>
-        <w:t xml:space="preserve"> CI </w:t>
-      </w:r>
-      <w:r>
-        <w:rPr>
-          <w:rFonts w:hint="eastAsia"/>
-        </w:rPr>
-        <w:t xml:space="preserve">矩阵（webui</w:t>
-      </w:r>
-      <w:r>
-        <w:t xml:space="preserve"> </w:t>
-      </w:r>
-      <w:r>
-        <w:rPr>
-          <w:rFonts w:hint="eastAsia"/>
-        </w:rPr>
-        <w:t xml:space="preserve">测试需符合其</w:t>
-      </w:r>
-      <w:r>
-        <w:t xml:space="preserve"> lint </w:t>
-      </w:r>
-      <w:r>
-        <w:rPr>
-          <w:rFonts w:hint="eastAsia"/>
-        </w:rPr>
-        <w:t xml:space="preserve">门禁）</w:t>
+        <w:t xml:space="preserve">消融并行化（多</w:t>
+      </w:r>
+      <w:r>
+        <w:t xml:space="preserve"> provider </w:t>
+      </w:r>
+      <w:r>
+        <w:rPr>
+          <w:rFonts w:hint="eastAsia"/>
+        </w:rPr>
+        <w:t xml:space="preserve">同时跑）或持久化历史</w:t>
       </w:r>
     </w:p>
     <w:p>
@@ -5722,10 +6246,79 @@
         <w:pStyle w:val="Compact"/>
         <w:numPr>
           <w:ilvl w:val="0"/>
-          <w:numId w:val="1003"/>
+          <w:numId w:val="1004"/>
         </w:numPr>
       </w:pPr>
       <w:r>
+        <w:t xml:space="preserve">WebSocket </w:t>
+      </w:r>
+      <w:r>
+        <w:rPr>
+          <w:rFonts w:hint="eastAsia"/>
+        </w:rPr>
+        <w:t xml:space="preserve">推送替代轮询</w:t>
+      </w:r>
+    </w:p>
+    <w:p>
+      <w:pPr>
+        <w:pStyle w:val="Compact"/>
+        <w:numPr>
+          <w:ilvl w:val="0"/>
+          <w:numId w:val="1004"/>
+        </w:numPr>
+      </w:pPr>
+      <w:r>
+        <w:rPr>
+          <w:rFonts w:hint="eastAsia"/>
+        </w:rPr>
+        <w:t xml:space="preserve">上游把</w:t>
+      </w:r>
+      <w:r>
+        <w:t xml:space="preserve"> context </w:t>
+      </w:r>
+      <w:r>
+        <w:rPr>
+          <w:rFonts w:hint="eastAsia"/>
+        </w:rPr>
+        <w:t xml:space="preserve">收进</w:t>
+      </w:r>
+      <w:r>
+        <w:t xml:space="preserve"> CI </w:t>
+      </w:r>
+      <w:r>
+        <w:rPr>
+          <w:rFonts w:hint="eastAsia"/>
+        </w:rPr>
+        <w:t xml:space="preserve">矩阵（webui</w:t>
+      </w:r>
+      <w:r>
+        <w:t xml:space="preserve"> </w:t>
+      </w:r>
+      <w:r>
+        <w:rPr>
+          <w:rFonts w:hint="eastAsia"/>
+        </w:rPr>
+        <w:t xml:space="preserve">测试需符合其</w:t>
+      </w:r>
+      <w:r>
+        <w:t xml:space="preserve"> lint </w:t>
+      </w:r>
+      <w:r>
+        <w:rPr>
+          <w:rFonts w:hint="eastAsia"/>
+        </w:rPr>
+        <w:t xml:space="preserve">门禁）</w:t>
+      </w:r>
+    </w:p>
+    <w:p>
+      <w:pPr>
+        <w:pStyle w:val="Compact"/>
+        <w:numPr>
+          <w:ilvl w:val="0"/>
+          <w:numId w:val="1004"/>
+        </w:numPr>
+      </w:pPr>
+      <w:r>
         <w:rPr>
           <w:rFonts w:hint="eastAsia"/>
         </w:rPr>
@@ -5741,8 +6334,8 @@
         <w:t xml:space="preserve">行</w:t>
       </w:r>
     </w:p>
-    <w:bookmarkEnd w:id="18"/>
     <w:bookmarkEnd w:id="19"/>
+    <w:bookmarkEnd w:id="20"/>
     <w:sectPr>
       <w:footnotePr>
         <w:numRestart w:val="eachSect"/>
@@ -6048,9 +6641,39 @@
     <w:abstractNumId w:val="991"/>
   </w:num>
   <w:num w:numId="1002">
+    <w:abstractNumId w:val="99411"/>
+    <w:lvlOverride w:ilvl="0">
+      <w:startOverride w:val="1"/>
+    </w:lvlOverride>
+    <w:lvlOverride w:ilvl="1">
+      <w:startOverride w:val="1"/>
+    </w:lvlOverride>
+    <w:lvlOverride w:ilvl="2">
+      <w:startOverride w:val="1"/>
+    </w:lvlOverride>
+    <w:lvlOverride w:ilvl="3">
+      <w:startOverride w:val="1"/>
+    </w:lvlOverride>
+    <w:lvlOverride w:ilvl="4">
+      <w:startOverride w:val="1"/>
+    </w:lvlOverride>
+    <w:lvlOverride w:ilvl="5">
+      <w:startOverride w:val="1"/>
+    </w:lvlOverride>
+    <w:lvlOverride w:ilvl="6">
+      <w:startOverride w:val="1"/>
+    </w:lvlOverride>
+    <w:lvlOverride w:ilvl="7">
+      <w:startOverride w:val="1"/>
+    </w:lvlOverride>
+    <w:lvlOverride w:ilvl="8">
+      <w:startOverride w:val="1"/>
+    </w:lvlOverride>
+  </w:num>
+  <w:num w:numId="1003">
     <w:abstractNumId w:val="991"/>
   </w:num>
-  <w:num w:numId="1003">
+  <w:num w:numId="1004">
     <w:abstractNumId w:val="99411"/>
     <w:lvlOverride w:ilvl="0">
       <w:startOverride w:val="1"/>

</xml_diff>